<commit_message>
docs: update presentation deck and script to protocol v2
The deck grows to 18 slides: correct the trailing-one sign mapping, replace the removed safety-filter/quality-gate story with the keyed per-IDR schedule, add a slide on HKDF subkeys, the authenticated frame and whitening, and update extraction, mandatory Groth16 verify, the HTTP verify job, scope and speaker-note sources. The spoken script follows the new deck.

Co-Authored-By: Claude Opus 5.5 (1M context) <noreply@anthropic.com>
</commit_message>
<xml_diff>
--- a/VideoLevel/output/documents/zkstego_presentation_script_v4.docx
+++ b/VideoLevel/output/documents/zkstego_presentation_script_v4.docx
@@ -16,7 +16,7 @@
         <w:pStyle w:val="Subtitle"/>
       </w:pPr>
       <w:r>
-        <w:t>Kịch bản theo 17 slide  Thời lượng gợi ý 15 đến 18 phút</w:t>
+        <w:t xml:space="preserve">Kịch bản theo 18 slide  Thời lượng gợi ý 16 đến 20 phút</w:t>
       </w:r>
     </w:p>
     <w:p>
@@ -29,7 +29,7 @@
           <w:rFonts w:ascii="Arial" w:hAnsi="Arial"/>
           <w:i w:val="0"/>
         </w:rPr>
-        <w:t>Tài liệu này là lời thoại để trình bày cùng deck ZK-SNARK x Video Steganography. Mỗi phần tương ứng với một slide. Có thể đọc gần như nguyên văn, hoặc dùng như khung nói để điều chỉnh theo đối tượng người nghe. Khi nói các thuật ngữ CAVLC, IDR hoặc Groth16, nên chỉ trực tiếp vào hình trên slide để giữ mạch giải thích trực quan.</w:t>
+        <w:t>Tài liệu này là lời thoại để trình bày cùng deck ZK-SNARK x Video Steganography, cập nhật theo hệ thống hiện tại (giao thức kênh v2, Groth16 bắt buộc). Mỗi phần tương ứng với một slide. Có thể đọc gần như nguyên văn, hoặc dùng như khung nói để điều chỉnh theo đối tượng người nghe. Khi nói các thuật ngữ CAVLC, IDR, HMAC hoặc Groth16, nên chỉ trực tiếp vào hình trên slide để giữ mạch giải thích trực quan. Nguồn đối chiếu: doc/he_thong_hoat_dong.md và README.md.</w:t>
       </w:r>
     </w:p>
     <w:p>
@@ -37,7 +37,7 @@
         <w:pStyle w:val="Heading1"/>
       </w:pPr>
       <w:r>
-        <w:t>Mở đầu và hệ thống</w:t>
+        <w:t xml:space="preserve">Mở đầu và hệ thống</w:t>
       </w:r>
     </w:p>
     <w:p>
@@ -45,7 +45,7 @@
         <w:pStyle w:val="Heading2"/>
       </w:pPr>
       <w:r>
-        <w:t>Slide 1  ZK SNARK và video steganography</w:t>
+        <w:t xml:space="preserve">Slide 1  ZK SNARK và video steganography</w:t>
       </w:r>
     </w:p>
     <w:p>
@@ -60,7 +60,7 @@
           <w:rFonts w:ascii="Arial" w:hAnsi="Arial"/>
           <w:i w:val="0"/>
         </w:rPr>
-        <w:t>Chào mọi người. Bài trình bày này giải thích cách một bằng chứng ZK-SNARK có thể được mang trong một video H.264 mà video vẫn có thể giải mã và xem bình thường. Có hai câu hỏi chính. Thứ nhất, chúng ta giấu dữ liệu vào đâu trong video nén. Thứ hai, khi lấy dữ liệu ra, làm sao biết đó là bằng chứng hợp lệ chứ không chỉ là một chuỗi byte bất kỳ. Phần đầu sẽ đi từ cover video xuống một coefficient CAVLC. Phần sau quay ngược từ payload tới bước kiểm chứng Groth16.</w:t>
+        <w:t>Chào mọi người. Bài trình bày này giải thích cách một bằng chứng ZK-SNARK được mang trong một video H.264 mà video vẫn giải mã và xem bình thường. Có hai câu hỏi chính. Thứ nhất, chúng ta giấu dữ liệu vào đâu trong video nén. Thứ hai, khi lấy dữ liệu ra, làm sao biết đó là dữ liệu của người có khóa và là bằng chứng hợp lệ, chứ không chỉ là một chuỗi byte bất kỳ. Phần đầu đi từ cover video xuống một coefficient CAVLC. Phần sau đi qua khóa, khung xác thực, trích xuất mù và bước verify Groth16 bắt buộc. Toàn bộ nội dung bám theo mã nguồn hiện tại, trong đó lõi media duy nhất là native C++.</w:t>
       </w:r>
     </w:p>
     <w:p>
@@ -91,7 +91,7 @@
         <w:pStyle w:val="Heading2"/>
       </w:pPr>
       <w:r>
-        <w:t>Slide 2  Sơ đồ hệ thống hiện tại</w:t>
+        <w:t xml:space="preserve">Slide 2  Sơ đồ hệ thống hiện tại</w:t>
       </w:r>
     </w:p>
     <w:p>
@@ -106,7 +106,7 @@
           <w:rFonts w:ascii="Arial" w:hAnsi="Arial"/>
           <w:i w:val="0"/>
         </w:rPr>
-        <w:t>Sơ đồ này có năm khối. ZK prover tạo message và Groth16 proof. Payload packer đóng chúng thành một blob có cấu trúc. Native CAVLC đọc bitstream H.264 và tìm các sign bit đủ điều kiện. Khối stego H.264 ghi payload đó vào video. Cuối cùng, extractor đọc lại payload và verifier kiểm tra proof. Điểm quan trọng là native path không tạo proof trong từng frame. Proof được tạo trước, còn native chỉ làm phần xử lý bitstream với độ trễ thấp.</w:t>
+        <w:t>Sơ đồ có năm khối. ZK prover nhận message và secret 32 byte, tạo proof Groth16 nén còn 129 byte. Khối thứ hai đóng gói payload gồm độ dài, message và proof, rồi bọc nó trong khung xác thực phiên bản 2: một byte version 0x02, hai byte độ dài, payload và tag HMAC 16 byte, sau đó làm trắng bằng keystream. Native CAVLC dùng lịch do khóa quyết định để chọn dấu trailing-one trong từng IDR. Khối thứ tư là stego H.264, vẫn decode được. Cuối cùng, bên nhận dùng cùng khóa để trích mù, bỏ làm trắng, kiểm version và HMAC, unpack, và bắt buộc verify Groth16 trước khi trả message. Proof được tạo trước, native chỉ đọc và lật bit dấu.</w:t>
       </w:r>
     </w:p>
     <w:p>
@@ -137,7 +137,7 @@
         <w:pStyle w:val="Heading2"/>
       </w:pPr>
       <w:r>
-        <w:t>Slide 3  Cover video là gì</w:t>
+        <w:t xml:space="preserve">Slide 3  Cover video là gì</w:t>
       </w:r>
     </w:p>
     <w:p>
@@ -152,7 +152,7 @@
           <w:rFonts w:ascii="Arial" w:hAnsi="Arial"/>
           <w:i w:val="0"/>
         </w:rPr>
-        <w:t>Cover video là video gốc được dùng làm vật mang. Người xem vẫn mở và xem video như bình thường. Hệ thống không đi sửa trực tiếp pixel đang hiển thị trên màn hình. Nó đi sâu hơn vào luồng mã hóa H.264, cụ thể là các coefficient residual đã qua transform và quantization. Ở một số vị trí được lọc, hệ thống chỉ đổi dấu của coefficient có độ lớn bằng một. Vì chỉ thay dấu và chỉ chọn vị trí phù hợp, thay đổi thị giác thường nhỏ hơn nhiều so với sửa pixel trực tiếp.</w:t>
+        <w:t>Cover video là video gốc được dùng làm vật mang. Người xem vẫn mở và xem video như bình thường. Hệ thống không sửa trực tiếp pixel đang hiển thị. Nó đi vào luồng mã hóa H.264, tới các coefficient residual đã qua biến đổi và lượng tử hóa, và chỉ lật dấu của một số coefficient có độ lớn bằng một. Mỗi lần lật đổi một hệ số cộng một thành trừ một hoặc ngược lại, nên sai khác rất nhỏ. Sai khác đó vẫn có thể lan nhẹ qua dự đoán intra và bộ lọc deblocking, vì vậy demo đo PSNR và in bản đồ sai khác để chúng ta quan sát.</w:t>
       </w:r>
     </w:p>
     <w:p>
@@ -175,7 +175,7 @@
           <w:i/>
           <w:color w:val="50607C"/>
         </w:rPr>
-        <w:t>Để native có thể đọc video đúng cách, định dạng đầu vào cần được chuẩn hóa.</w:t>
+        <w:t>Để native đọc video đúng cách, định dạng đầu vào cần được chuẩn hóa.</w:t>
       </w:r>
     </w:p>
     <w:p>
@@ -183,7 +183,7 @@
         <w:pStyle w:val="Heading2"/>
       </w:pPr>
       <w:r>
-        <w:t>Slide 4  Định dạng input mà Native CAVLC nhận</w:t>
+        <w:t xml:space="preserve">Slide 4  Định dạng input mà Native CAVLC nhận</w:t>
       </w:r>
     </w:p>
     <w:p>
@@ -198,7 +198,7 @@
           <w:rFonts w:ascii="Arial" w:hAnsi="Arial"/>
           <w:i w:val="0"/>
         </w:rPr>
-        <w:t>Native parser nhận elementary stream H.264 theo Annex-B. Nghĩa là nó cần chuỗi NAL thô có start code, chứ không nhận trực tiếp container như MP4, MOV hoặc MKV. Nếu đầu vào là container, hệ thống dùng FFmpeg để tách hoặc xuất raw H.264 Annex-B trước. Phạm vi hiện tại tập trung vào CAVLC, IDR I-slice và frame-only. CABAC, P-frame, B-frame và nhiều nhánh phức tạp khác chưa được hứa hẹn trong native path này.</w:t>
+        <w:t>Native parser nhận elementary stream H.264 theo Annex-B, tức chuỗi NAL thô có start code, chứ không nhận trực tiếp container như MP4, MOV hay MKV. Video thô dạng y4m trong demo được FFmpeg và libx264 encode về profile Baseline, tắt CABAC, một slice mỗi frame, không B-frame. Parser chỉ chấp nhận CAVLC, progressive, 4:2:0, một slice mỗi frame bắt đầu ở macroblock 0, và chỉ IDR mang dữ liệu. CABAC, slice groups và P hoặc B frame chưa phải vật mang. Nếu đầu vào sai, parser từ chối thay vì đọc lệch.</w:t>
       </w:r>
     </w:p>
     <w:p>
@@ -229,7 +229,7 @@
         <w:pStyle w:val="Heading2"/>
       </w:pPr>
       <w:r>
-        <w:t>Slide 5  Một NAL IDR nhìn như dải hex</w:t>
+        <w:t xml:space="preserve">Slide 5  Một NAL IDR nhìn như dải hex</w:t>
       </w:r>
     </w:p>
     <w:p>
@@ -244,7 +244,7 @@
           <w:rFonts w:ascii="Arial" w:hAnsi="Arial"/>
           <w:i w:val="0"/>
         </w:rPr>
-        <w:t>Slide này cho thấy một NAL dưới dạng các byte hex. Bốn byte 00 00 00 01 là start code, tức mốc để parser tách một NAL mới. Byte 65 là ví dụ NAL header cho IDR slice. Sau đó là slice header và slice data. Dữ liệu residual được CAVLC mã hóa nằm sâu trong slice data, không nằm ở start code hay header. Vì thế native phải đi đúng thứ tự: tách NAL, kiểm tra loại NAL, parse slice phù hợp, rồi mới đi tới residual. Nếu sai ranh giới ngay từ đầu, mọi bit offset phía sau đều không còn đáng tin cậy.</w:t>
+        <w:t>Slide này cho thấy một NAL dưới dạng các byte hex. Bốn byte 00 00 00 01 là start code, mốc để parser tách một NAL mới. Byte 65 là NAL header của một IDR slice. Sau đó là slice header và slice data. Bên trong NAL, encoder chèn byte 03 để tránh giả start code; parser bỏ các byte đó để có RBSP, và mọi offset bit được tính trên RBSP. Dữ liệu residual CAVLC nằm sâu trong slice data. Header không bao giờ là vị trí nhúng. Native phải tách đúng NAL, kiểm tra loại NAL, parse slice, rồi mới đi tới residual để liệt kê dấu trailing-one ứng viên.</w:t>
       </w:r>
     </w:p>
     <w:p>
@@ -275,7 +275,7 @@
         <w:pStyle w:val="Heading1"/>
       </w:pPr>
       <w:r>
-        <w:t>Từ frame đến CAVLC</w:t>
+        <w:t xml:space="preserve">Từ frame đến CAVLC</w:t>
       </w:r>
     </w:p>
     <w:p>
@@ -283,7 +283,7 @@
         <w:pStyle w:val="Heading2"/>
       </w:pPr>
       <w:r>
-        <w:t>Slide 6  Từ video đến một coefficient</w:t>
+        <w:t xml:space="preserve">Slide 6  Từ video đến một coefficient</w:t>
       </w:r>
     </w:p>
     <w:p>
@@ -298,7 +298,7 @@
           <w:rFonts w:ascii="Arial" w:hAnsi="Arial"/>
           <w:i w:val="0"/>
         </w:rPr>
-        <w:t>Hãy nhìn quá trình phóng to này như khi ta zoom vào một ảnh. Video gồm nhiều frame. Với một frame IDR, H.264 chia ảnh thành các macroblock 16 nhân 16. Bên trong macroblock có các block residual 4 nhân 4. Sau transform và quantization, residual trở thành các coefficient. Native không có capacity ở mọi pixel hay mọi byte trong file. Capacity chỉ đến từ những coefficient hợp lệ trong phạm vi parser hỗ trợ. Vì vậy số vị trí nhúng phải được đo sau khi parse, không thể đo đơn giản từ thời lượng video.</w:t>
+        <w:t>Hãy nhìn quá trình này như khi ta zoom vào một ảnh. Video gồm nhiều frame. Với một frame IDR, H.264 chia ảnh thành các macroblock 16 nhân 16. Bên trong macroblock là các block residual 4 nhân 4 và các block DC, chroma. Sau biến đổi và lượng tử hóa, residual trở thành coefficient. Dung lượng không đến từ mọi pixel hay mọi byte. Nó bằng số block có trailing-one trong các IDR. Ví dụ clip demo 8 frame CIF có khoảng 3 660 ứng viên. Vì vậy dung lượng phải được đo sau khi parse, bằng công cụ zkstego_inspect, chứ không suy ra từ thời lượng video.</w:t>
       </w:r>
     </w:p>
     <w:p>
@@ -329,7 +329,7 @@
         <w:pStyle w:val="Heading2"/>
       </w:pPr>
       <w:r>
-        <w:t>Slide 7  Trong một frame Native tìm macroblock</w:t>
+        <w:t xml:space="preserve">Slide 7  Trong một frame Native tìm macroblock</w:t>
       </w:r>
     </w:p>
     <w:p>
@@ -344,7 +344,7 @@
           <w:rFonts w:ascii="Arial" w:hAnsi="Arial"/>
           <w:i w:val="0"/>
         </w:rPr>
-        <w:t>Một macroblock trong I-frame dùng intra prediction để dự đoán vùng ảnh từ các mẫu lân cận. Hệ thống lấy phần chênh lệch giữa ảnh thật và ảnh dự đoán, gọi là residual. Residual được transform sang miền coefficient, rồi quantization làm nhiều giá trị nhỏ trở thành zero. CAVLC sẽ nén các coefficient còn lại. Mắt người chỉ thấy frame hoàn chỉnh. Native thì chỉ quan tâm tới một vài coefficient nhỏ sau các bước này. Đó là lý do ta phải hiểu thứ tự mã hóa thay vì chỉ nhìn video như một ma trận pixel.</w:t>
+        <w:t>Một macroblock trong I-frame dùng intra prediction để dự đoán vùng ảnh từ các mẫu lân cận đã tái tạo. Phần chênh lệch giữa ảnh thật và ảnh dự đoán là residual. Residual được biến đổi sang coefficient, rồi lượng tử hóa làm nhiều giá trị nhỏ trở thành không. CAVLC nén các coefficient còn lại. Mắt người chỉ thấy frame hoàn chỉnh. Native không đụng tới mode dự đoán, coded block pattern hay QP; nó chỉ lật dấu của một số coefficient nhỏ. Nhờ vậy mọi trường cú pháp khác giữ nguyên.</w:t>
       </w:r>
     </w:p>
     <w:p>
@@ -375,7 +375,7 @@
         <w:pStyle w:val="Heading2"/>
       </w:pPr>
       <w:r>
-        <w:t>Slide 8  Pixel gốc không trở thành bit ngay</w:t>
+        <w:t xml:space="preserve">Slide 8  Pixel gốc không trở thành bit ngay</w:t>
       </w:r>
     </w:p>
     <w:p>
@@ -390,7 +390,7 @@
           <w:rFonts w:ascii="Arial" w:hAnsi="Arial"/>
           <w:i w:val="0"/>
         </w:rPr>
-        <w:t>Hình bên trái là mảng pixel gốc. H.264 trước hết dự đoán một mảng pixel tương tự. Phần sai khác giữa hai mảng là residual. Sau transform và quantization, residual trở thành một block coefficient 4 nhân 4. Chính block coefficient đó mới được entropy-code bằng CAVLC. Đây là ranh giới quan trọng của hệ thống. Payload không được nhúng vào mảng pixel gốc. Nó được ánh xạ vào một sign bit của coefficient đã qua safety filter. Cách làm này giữ thay đổi ở lớp mã hóa thay vì chạm thẳng vào ảnh hiển thị.</w:t>
+        <w:t>Hình bên trái là mảng pixel gốc. H.264 dự đoán một mảng tương tự; phần sai khác là residual. Sau biến đổi và lượng tử hóa, residual trở thành một block coefficient 4 nhân 4, và chính block này mới được mã hóa bằng CAVLC. Payload không được nhúng vào pixel. Nó được ghi vào dấu của một coefficient trailing-one. Trong demo có một ví dụ thật: hệ số trừ một đổi thành cộng một làm một hàng residual đổi từ 1, 2, 4, 5 thành 5, 4, 2, 1, và demo kiểm từng mẫu khớp với ảnh FFmpeg giải ra.</w:t>
       </w:r>
     </w:p>
     <w:p>
@@ -421,7 +421,7 @@
         <w:pStyle w:val="Heading2"/>
       </w:pPr>
       <w:r>
-        <w:t>Slide 9  Native CAVLC đang làm gì</w:t>
+        <w:t xml:space="preserve">Slide 9  Native CAVLC đang làm gì</w:t>
       </w:r>
     </w:p>
     <w:p>
@@ -436,7 +436,7 @@
           <w:rFonts w:ascii="Arial" w:hAnsi="Arial"/>
           <w:i w:val="0"/>
         </w:rPr>
-        <w:t>Native làm bốn việc có thứ tự. Parse để tách NAL và đọc slice. Decode vừa đủ để hiểu coeff_token, sign, level và run. Record để lưu bit offset của các sign-bit candidate cùng metadata của block. Cuối cùng patch đúng bit đã được chọn. Việc record offset là rất quan trọng. Native không quét lại và đoán vị trí lần hai. Nó dùng đúng offset thu được trong lúc decoder hiểu đầy đủ ngữ cảnh của block. Nhờ đó bước patch có tính quyết định và extractor có cùng quy tắc để đọc lại.</w:t>
+        <w:t>Native làm bốn việc có thứ tự. Parse để tách NAL, bỏ byte chống giả start code và đọc slice. Decode vừa đủ để hiểu coeff_token, dấu, level và run. Record để lưu offset của dấu trailing-one đầu tiên trong mỗi block, cùng định danh gồm NAL, macroblock, loại block, chỉ số block và offset bit. Cuối cùng patch, tức lật đúng bit dấu mà lịch có khóa chọn. Vì offset được ghi ngay lúc decode, writer sửa đúng bit mà không phải đoán. Công cụ zkstego_inspect xuất chính dữ liệu này dạng JSON, có chế độ tóm tắt, xem từng macroblock và liệt kê ứng viên theo đoạn.</w:t>
       </w:r>
     </w:p>
     <w:p>
@@ -459,7 +459,7 @@
           <w:i/>
           <w:color w:val="50607C"/>
         </w:rPr>
-        <w:t>Muốn hiểu sign bit được chọn ở đâu, ta cần nhìn cấu trúc của một block CAVLC.</w:t>
+        <w:t>Muốn hiểu dấu nào được dùng, ta cần nhìn cấu trúc của một block CAVLC.</w:t>
       </w:r>
     </w:p>
     <w:p>
@@ -467,7 +467,7 @@
         <w:pStyle w:val="Heading2"/>
       </w:pPr>
       <w:r>
-        <w:t>Slide 10  Một block CAVLC chứa những gì</w:t>
+        <w:t xml:space="preserve">Slide 10  Một block CAVLC chứa những gì</w:t>
       </w:r>
     </w:p>
     <w:p>
@@ -482,7 +482,7 @@
           <w:rFonts w:ascii="Arial" w:hAnsi="Arial"/>
           <w:i w:val="0"/>
         </w:rPr>
-        <w:t>Ở bên trái là coefficient block gốc. Từ đó CAVLC ghi năm loại thông tin. Thứ nhất, coeff_token cho decoder biết số coefficient khác zero và số trailing-one. Thứ hai, T1 signs là dấu của các trailing-one, tức các coefficient cuối có magnitude bằng một. Đây là vùng màu cam và là ứng viên cho payload. Thứ ba, levels mang magnitude của các coefficient còn lại. Thứ tư, total_zeros cho biết lượng zero cần phân bổ. Cuối cùng, run_before chỉ cách các zero nằm trước từng coefficient khi dựng lại block. Decoder phải đọc đúng thứ tự này. Native chỉ thay sign ở vùng T1 sau khi safety filter xác nhận vị trí đó an toàn.</w:t>
+        <w:t>Ở bên trái là coefficient block gốc. CAVLC ghi năm loại thông tin theo thứ tự. coeff_token cho biết số coefficient khác không và số trailing-one. T1 signs là cờ dấu của tối đa ba trailing-one: cờ 0 là cộng một, cờ 1 là trừ một. Đây là vùng màu cam. Levels mang magnitude của các coefficient còn lại. total_zeros cho biết số không cần phân bổ, và run_before chỉ cách các số không nằm trước từng coefficient. Cờ dấu là một bit cố định, đổi giá trị không đổi độ dài. Native lấy cờ dấu của trailing-one đầu tiên trong mỗi block làm ứng viên duy nhất của block đó.</w:t>
       </w:r>
     </w:p>
     <w:p>
@@ -505,7 +505,7 @@
           <w:i/>
           <w:color w:val="50607C"/>
         </w:rPr>
-        <w:t>Tuy nhiên có sign bit không đồng nghĩa với có một vị trí nhúng hợp lệ. Slide tiếp theo giải thích bộ lọc này.</w:t>
+        <w:t>Vì sao đổi dấu này an toàn, và ai quyết định dùng ứng viên nào? Slide tiếp theo trả lời.</w:t>
       </w:r>
     </w:p>
     <w:p>
@@ -513,7 +513,7 @@
         <w:pStyle w:val="Heading1"/>
       </w:pPr>
       <w:r>
-        <w:t>Nhúng an toàn và trích xuất</w:t>
+        <w:t xml:space="preserve">Nhúng, khóa và trích xuất</w:t>
       </w:r>
     </w:p>
     <w:p>
@@ -521,7 +521,7 @@
         <w:pStyle w:val="Heading2"/>
       </w:pPr>
       <w:r>
-        <w:t>Slide 11  Chọn vị trí an toàn để làm gì</w:t>
+        <w:t xml:space="preserve">Slide 11  Vì sao đổi dấu T1 an toàn và chọn vị trí bằng khóa</w:t>
       </w:r>
     </w:p>
     <w:p>
@@ -536,7 +536,7 @@
           <w:rFonts w:ascii="Arial" w:hAnsi="Arial"/>
           <w:i w:val="0"/>
         </w:rPr>
-        <w:t>Một vị trí chỉ trở thành operating position sau bốn lớp kiểm tra. Nó phải nằm trong Annex-B, IDR I-slice và CAVLC path mà native hỗ trợ. Nó phải là trailing-one với magnitude bằng một. Khi patch, thao tác chỉ đổi sign bit nên giữ độ dài codeword. Cuối cùng, stream sau patch phải qua strict decode và quality gate. Tại sao cần chặt chẽ như vậy? Nếu chọn sai vị trí, decoder có thể đọc lệch phần còn lại của stream, video có thể không decode, hoặc extractor khôi phục payload sai. Safety filter bảo vệ đồng thời khả năng xem video, khả năng đọc lại payload và chất lượng đầu ra.</w:t>
+        <w:t>Có bốn ý. Một, chỉ xét vùng được hỗ trợ: Annex-B, slice IDR, CAVLC Baseline. Hai, mỗi block góp đúng một ứng viên, là dấu trailing-one đầu tiên, thuộc mọi loại block LumaDC, Luma4x4, ChromaDC và ChromaAC. Ba, lật bit dấu không làm lệch stream: độ dài mã giữ nguyên, TotalCoeff và TrailingOnes không đổi nên ngữ cảnh nC và toàn bộ cú pháp phía sau giữ nguyên. Vì vậy hệ thống không cần bộ lọc vị trí hay quality gate; tính decode được xác nhận bằng strict decode FFmpeg trong test và demo. Bốn, vị trí do khóa quyết định: mỗi ứng viên có score bằng HMAC-SHA256 với khóa lịch trên định danh của nó, các ứng viên được sắp xếp, và mỗi IDR mang tối đa 64 bit theo mặc định. Người không có khóa không biết bit nằm ở đâu.</w:t>
       </w:r>
     </w:p>
     <w:p>
@@ -559,7 +559,7 @@
           <w:i/>
           <w:color w:val="50607C"/>
         </w:rPr>
-        <w:t>Khi một vị trí đã an toàn, cách nhúng một bit rất đơn giản.</w:t>
+        <w:t>Khi đã có vị trí, cách ghi một bit rất đơn giản.</w:t>
       </w:r>
     </w:p>
     <w:p>
@@ -567,7 +567,7 @@
         <w:pStyle w:val="Heading2"/>
       </w:pPr>
       <w:r>
-        <w:t>Slide 12  Nhúng một payload bit vào dấu T1</w:t>
+        <w:t xml:space="preserve">Slide 12  Nhúng một bit khung vào dấu T1</w:t>
       </w:r>
     </w:p>
     <w:p>
@@ -582,7 +582,7 @@
           <w:rFonts w:ascii="Arial" w:hAnsi="Arial"/>
           <w:i w:val="0"/>
         </w:rPr>
-        <w:t>Giả sử payload bit cần nhúng là một. Hệ thống chọn một T1 sign đã qua lọc và dùng quy ước cố định, ví dụ dấu dương biểu diễn bit một, dấu âm biểu diễn bit không. Nếu coefficient đang là âm một, native đổi nó thành dương một. Magnitude vẫn là một, chỉ có dấu thay đổi. Quy ước mapping này phải hoàn toàn giống nhau ở hai đầu. Nếu embed dùng dấu dương cho bit một nhưng extractor hiểu ngược lại, video vẫn decode được nhưng payload sẽ bị đảo hoặc hỏng.</w:t>
+        <w:t>Quy ước dấu là cờ 0 nghĩa là cộng một, cờ 1 nghĩa là trừ một. Bit được ghi không phải bit khung thô. Nó là bit khung XOR với một bit keystream, gọi là bit đã làm trắng. Bit thứ i đó được ghi vào ứng viên có thứ hạng i trong lịch. Hình minh họa trường hợp bit nhúng bằng không: dấu đích là cộng, nên hệ số đang là trừ một được đổi thành cộng một, tức cờ dấu từ 1 thành 0. Nếu dấu hiện tại đã đúng thì không cần lật. Magnitude luôn giữ nguyên. Quy ước và keystream phải giống hệt ở hai đầu, nếu không payload sai dù video vẫn decode.</w:t>
       </w:r>
     </w:p>
     <w:p>
@@ -605,7 +605,7 @@
           <w:i/>
           <w:color w:val="50607C"/>
         </w:rPr>
-        <w:t>Sau khi đổi một số sign bit, native phải tạo lại output stream và kiểm tra nó.</w:t>
+        <w:t>Vậy khung, keystream và các khóa đó đến từ đâu?</w:t>
       </w:r>
     </w:p>
     <w:p>
@@ -613,7 +613,7 @@
         <w:pStyle w:val="Heading2"/>
       </w:pPr>
       <w:r>
-        <w:t>Slide 13  Sau khi patch tạo lại stego H264</w:t>
+        <w:t xml:space="preserve">Slide 13  Khóa và khung xác thực giao thức v2</w:t>
       </w:r>
     </w:p>
     <w:p>
@@ -628,7 +628,53 @@
           <w:rFonts w:ascii="Arial" w:hAnsi="Arial"/>
           <w:i w:val="0"/>
         </w:rPr>
-        <w:t>Native writer sử dụng context parse và bit offsets đã lưu để ghi các thay đổi vào stream đầu ra. Kết quả là stego H.264. Nhưng việc ghi xong chưa phải là thành công. Hệ thống còn kiểm tra số bit đã áp dụng, chạy strict decode để phát hiện lỗi bitstream, và đánh giá quality gate như PSNR hoặc SSIM theo cấu hình thử nghiệm. Chỉ khi các kiểm tra này đạt, output mới được nhận. Như vậy quy trình nhúng không phải là sửa byte rồi hy vọng video vẫn chạy. Nó là một chuỗi parse, patch và xác nhận có kiểm soát.</w:t>
+        <w:t>Mọi thứ xuất phát từ một secret 32 byte. HKDF-SHA256 sinh ra ba khóa con tách vai trò: schedule_key để chọn vị trí, frame_key để tính tag, whitening_key để sinh keystream. Lộ một khóa con không làm lộ secret hay các khóa khác. Khung v2 gồm byte version 0x02, hai byte độ dài, payload và tag là 16 byte đầu của HMAC-SHA256 với frame_key trên version, độ dài và payload. Sau đó mỗi bit khung được XOR với keystream. Làm trắng xóa thiên lệch của byte version cố định, trường độ dài nhỏ và cấu trúc proof, nên các dấu được chọn trông như ngẫu nhiên. Nếu bên nhận dùng sai khóa, byte version sau khi bỏ làm trắng gần như ngẫu nhiên và khung bị từ chối ngay. Nếu một bit bị sửa, tag sai và khung cũng bị từ chối.</w:t>
+      </w:r>
+    </w:p>
+    <w:p>
+      <w:pPr>
+        <w:pStyle w:val="BodyText"/>
+        <w:keepLines/>
+        <w:spacing w:after="220"/>
+      </w:pPr>
+      <w:r>
+        <w:rPr>
+          <w:rFonts w:ascii="Arial" w:hAnsi="Arial"/>
+          <w:b/>
+          <w:color w:val="50607C"/>
+        </w:rPr>
+        <w:t xml:space="preserve">Chuyển ý: </w:t>
+      </w:r>
+      <w:r>
+        <w:rPr>
+          <w:rFonts w:ascii="Arial" w:hAnsi="Arial"/>
+          <w:i/>
+          <w:color w:val="50607C"/>
+        </w:rPr>
+        <w:t>Sau khi lật các bit dấu, native phải ghi lại output stream.</w:t>
+      </w:r>
+    </w:p>
+    <w:p>
+      <w:pPr>
+        <w:pStyle w:val="Heading2"/>
+      </w:pPr>
+      <w:r>
+        <w:t xml:space="preserve">Slide 14  Sau khi patch tạo lại stego H264</w:t>
+      </w:r>
+    </w:p>
+    <w:p>
+      <w:pPr>
+        <w:pStyle w:val="BodyText"/>
+        <w:keepNext/>
+        <w:keepLines/>
+        <w:spacing w:line="283" w:lineRule="auto"/>
+      </w:pPr>
+      <w:r>
+        <w:rPr>
+          <w:rFonts w:ascii="Arial" w:hAnsi="Arial"/>
+          <w:i w:val="0"/>
+        </w:rPr>
+        <w:t>Native writer lật bit trong RBSP tại các offset đã ghi, rồi đóng gói lại NAL và chèn lại byte chống giả start code. Độ dài bit RBSP không đổi, nhưng độ dài byte của NAL có thể lệch vài byte. Trong đường nhúng không có quality gate nào. Bằng chứng rằng output đúng đến từ test và demo: stego qua strict decode của FFmpeg, trích mù ra đúng payload, sai khóa bị từ chối, và output của job HTTP trùng từng byte với lệnh CLI. PSNR chỉ được đo và in ra trong demo và benchmark, không dùng để nhận hay loại.</w:t>
       </w:r>
     </w:p>
     <w:p>
@@ -659,7 +705,7 @@
         <w:pStyle w:val="Heading2"/>
       </w:pPr>
       <w:r>
-        <w:t>Slide 14  Trích xuất đi ngược chiều nhúng</w:t>
+        <w:t xml:space="preserve">Slide 15  Trích xuất đi ngược chiều nhúng</w:t>
       </w:r>
     </w:p>
     <w:p>
@@ -674,7 +720,7 @@
           <w:rFonts w:ascii="Arial" w:hAnsi="Arial"/>
           <w:i w:val="0"/>
         </w:rPr>
-        <w:t>Extractor không cần cover video gốc. Nó cần stego H.264 và key hoặc rules để tái lập các operating positions. Parser lại tách NAL, vào IDR và block CAVLC, sau đó đọc T1 sign theo cùng thứ tự. Các bit thu được được ghép thành payload blob. Cuối cùng hệ thống giải khung blob để lấy length, message và proof bytes. Đây là blind extraction. Lợi ích là người nhận không phải giữ video ban đầu. Điều kiện đổi lại là quy tắc chọn vị trí phải quyết định và tái lập chính xác ở hai bên.</w:t>
+        <w:t>Bên nhận không cần video gốc và không cần file vị trí đi kèm. Nó chỉ cần stego H.264 và cùng secret. Parser tách lại các IDR và liệt kê ứng viên, giống hệt phía gửi vì lật dấu không đổi cấu trúc. Từ secret, bên nhận sinh lại khóa con, dựng lại cùng lịch, đọc các bit, bỏ làm trắng 24 bit đầu để kiểm version 0x02 và độ dài, rồi đọc đủ khung và so tag HMAC theo thời gian hằng. Sai khóa, bit bị sửa, độ dài vượt giới hạn hay hết video trước khi đủ khung đều dẫn đến từ chối. Hai đầu cũng phải dùng cùng giới hạn bit mỗi IDR.</w:t>
       </w:r>
     </w:p>
     <w:p>
@@ -697,7 +743,7 @@
           <w:i/>
           <w:color w:val="50607C"/>
         </w:rPr>
-        <w:t>Payload sau khi trích xuất chưa đủ. Ta còn phải chứng minh nó hợp lệ bằng Groth16.</w:t>
+        <w:t>HMAC đúng mới chỉ cho biết payload đến từ người có khóa. Ta còn phải kiểm proof Groth16.</w:t>
       </w:r>
     </w:p>
     <w:p>
@@ -705,7 +751,7 @@
         <w:pStyle w:val="Heading2"/>
       </w:pPr>
       <w:r>
-        <w:t>Slide 15  Payload trở lại thành bằng chứng Groth16</w:t>
+        <w:t xml:space="preserve">Slide 16  Payload trở lại thành bằng chứng Groth16</w:t>
       </w:r>
     </w:p>
     <w:p>
@@ -720,7 +766,7 @@
           <w:rFonts w:ascii="Arial" w:hAnsi="Arial"/>
           <w:i w:val="0"/>
         </w:rPr>
-        <w:t>Ở bước cuối của đường dữ liệu, payload blob được tách thành message và proof. Verifier nhận proof, public signals và verification key để kiểm tra Groth16. Video decode được chỉ cho biết bitstream vẫn hợp lệ. Verify thành công mới cho biết payload mang một bằng chứng đúng với mệnh đề mà hệ thống yêu cầu. Đây là điểm nối hai ý tưởng của deck. Steganography mang dữ liệu qua video. Zero knowledge proof xác nhận dữ liệu đó có ý nghĩa và hợp lệ mà không cần tiết lộ witness bí mật.</w:t>
+        <w:t>Sau trích mù, payload được tách thành message và proof 129 byte. Verify Groth16 là bắt buộc: chỉ khi proof hợp lệ, hệ thống mới trả message. Mạch chứng minh rằng commitment bằng SHA256 của SHA256 message nối với secret, với mọi tín hiệu hash, commitment và secret bị ràng buộc là 0 hoặc 1; mạch có 63 321 constraint và 513 public input. Verifier tự tính lại public signals từ message và secret, và snarkjs chỉ được chấp nhận khi thoát mã 0 và in OK. Cần nói rõ giới hạn: proof chưa gắn với video, nên có thể phát lại sang video khác dùng cùng khóa, và verifier phải giữ secret để tính lại commitment.</w:t>
       </w:r>
     </w:p>
     <w:p>
@@ -751,7 +797,7 @@
         <w:pStyle w:val="Heading1"/>
       </w:pPr>
       <w:r>
-        <w:t>Vận hành và phạm vi</w:t>
+        <w:t xml:space="preserve">Vận hành và phạm vi</w:t>
       </w:r>
     </w:p>
     <w:p>
@@ -759,7 +805,7 @@
         <w:pStyle w:val="Heading2"/>
       </w:pPr>
       <w:r>
-        <w:t>Slide 16  Hai cách hệ thống chạy</w:t>
+        <w:t xml:space="preserve">Slide 17  Hai cách hệ thống chạy</w:t>
       </w:r>
     </w:p>
     <w:p>
@@ -774,7 +820,7 @@
           <w:rFonts w:ascii="Arial" w:hAnsi="Arial"/>
           <w:i w:val="0"/>
         </w:rPr>
-        <w:t>Có hai con đường vận hành. Với HTTP job, client gửi video cùng message hoặc key, hệ thống đưa công việc vào worker rồi trả stego H.264 hoặc payload. Với WebSocket live, camera hoặc FFmpeg gửi các H.264 chunk liên tục vào adapter, native xử lý qua stdin và stdout. Hai con đường dùng chung native engine nên quy tắc parse và patch phải nhất quán. Ở đường live, backpressure đặc biệt quan trọng. Khi consumer xử lý chậm hơn producer, hệ thống phải làm chậm luồng vào để tránh mất chunk, tăng trễ vô hạn hoặc gây áp lực bộ nhớ.</w:t>
+        <w:t>Có hai con đường vận hành, dùng chung native engine và cùng giao thức theo đoạn IDR. Với HTTP job, client upload file H.264 cùng message và khóa, công việc vào hàng đợi có giới hạn và được native worker xử lý. Có ba loại job: embed, extract và verify. Job verify chỉ succeeded khi proof Groth16 đúng; nếu không, nó bị rejected kèm lý do. Kết quả được tải một lần. Với WebSocket live, camera hoặc FFmpeg gửi các chunk Annex-B vào adapter có backpressure, native xử lý qua stdin và stdout. Cả hai đều đòi Bearer token tối thiểu 32 ký tự, kiểm trước khi đọc body. Native không gọi prover trong vòng lặp camera: proof được tạo trước, còn verify nằm trong job verify hoặc ở bên nhận.</w:t>
       </w:r>
     </w:p>
     <w:p>
@@ -805,7 +851,7 @@
         <w:pStyle w:val="Heading2"/>
       </w:pPr>
       <w:r>
-        <w:t>Slide 17  Phạm vi kỹ thuật hiện tại</w:t>
+        <w:t xml:space="preserve">Slide 18  Phạm vi kỹ thuật hiện tại</w:t>
       </w:r>
     </w:p>
     <w:p>
@@ -820,7 +866,7 @@
           <w:rFonts w:ascii="Arial" w:hAnsi="Arial"/>
           <w:i w:val="0"/>
         </w:rPr>
-        <w:t>Phạm vi hiện tại gồm Annex-B H.264, Baseline hoặc Main dùng CAVLC, IDR I-slice, frame-only, blind extraction và strict decode trong cấu hình thử nghiệm. Những phần chưa thể khẳng định gồm CABAC, mọi GOP, P-frame, B-frame, slice groups, mọi camera, mọi độ phân giải và realtime 30 FPS. Khi dùng container, cần chuyển về raw H.264 Annex-B trước, kiểm tra entropy mode và chạy decode cùng quality validation. Thông điệp kết thúc là: cách nhúng an toàn bắt đầu từ việc hiểu đúng bitstream và giới hạn parser. Sau đó ta mới có thể nói chắc về payload và proof.</w:t>
+        <w:t>Đã xác nhận: H.264 Annex-B Baseline CAVLC, IDR, một slice mỗi frame, giao thức v2, trích mù với Groth16 bắt buộc và strict decode; bộ test đạt 126 trên 126 ngày 3 tháng 10 năm 2026 trên một máy Windows, đây là bằng chứng chức năng. Chưa khẳng định: CABAC, P hoặc B frame làm vật mang, mọi camera và độ phân giải, realtime 30 FPS, và việc gắn proof với video. Lần đo camera thật gần nhất đạt 7,608 FPS, đo trước bản tăng tốc native ngày 2 tháng 10 và chưa đo lại. Khi dùng, cần encode về Baseline CAVLC Annex-B, hai đầu dùng cùng secret và cùng giới hạn bit mỗi IDR; các số liệu benchmark và camera đã ghi có trước giao thức v2 nên cần chạy lại trước khi trích dẫn. Thông điệp kết thúc: lật dấu T1 giữ stream hợp lệ, khóa chọn vị trí và xác thực khung, còn Groth16 kiểm chứng payload.</w:t>
       </w:r>
     </w:p>
     <w:p>
@@ -843,7 +889,7 @@
           <w:i/>
           <w:color w:val="50607C"/>
         </w:rPr>
-        <w:t>Cảm ơn mọi người. Tôi sẵn sàng đi sâu thêm vào CAVLC, safety filter hoặc contract của payload.</w:t>
+        <w:t>Cảm ơn mọi người. Tôi sẵn sàng đi sâu thêm vào CAVLC, lịch có khóa, khung xác thực v2 hoặc mạch Groth16.</w:t>
       </w:r>
     </w:p>
     <w:sectPr>

</xml_diff>